<commit_message>
Finalize project documentation and architecture diagrams
</commit_message>
<xml_diff>
--- a/docs/Data_Engineering_PoC_Documentation.docx
+++ b/docs/Data_Engineering_PoC_Documentation.docx
@@ -866,6 +866,58 @@
       <w:pPr>
         <w:spacing w:after="40"/>
       </w:pPr>
+    </w:p>
+    <w:p>
+      <w:r>
+        <w:drawing>
+          <wp:inline xmlns:a="http://schemas.openxmlformats.org/drawingml/2006/main" xmlns:pic="http://schemas.openxmlformats.org/drawingml/2006/picture">
+            <wp:extent cx="5989320" cy="3668458"/>
+            <wp:docPr id="1" name="Picture 1"/>
+            <wp:cNvGraphicFramePr>
+              <a:graphicFrameLocks noChangeAspect="1"/>
+            </wp:cNvGraphicFramePr>
+            <a:graphic>
+              <a:graphicData uri="http://schemas.openxmlformats.org/drawingml/2006/picture">
+                <pic:pic>
+                  <pic:nvPicPr>
+                    <pic:cNvPr id="0" name="end_to_end_architecture.png"/>
+                    <pic:cNvPicPr/>
+                  </pic:nvPicPr>
+                  <pic:blipFill>
+                    <a:blip r:embed="rId10"/>
+                    <a:stretch>
+                      <a:fillRect/>
+                    </a:stretch>
+                  </pic:blipFill>
+                  <pic:spPr>
+                    <a:xfrm>
+                      <a:off x="0" y="0"/>
+                      <a:ext cx="5989320" cy="3668458"/>
+                    </a:xfrm>
+                    <a:prstGeom prst="rect"/>
+                  </pic:spPr>
+                </pic:pic>
+              </a:graphicData>
+            </a:graphic>
+          </wp:inline>
+        </w:drawing>
+      </w:r>
+    </w:p>
+    <w:p>
+      <w:pPr>
+        <w:spacing w:before="0" w:after="160" w:line="264" w:lineRule="auto"/>
+        <w:jc w:val="center"/>
+      </w:pPr>
+      <w:r>
+        <w:rPr>
+          <w:rFonts w:ascii="Calibri" w:hAnsi="Calibri"/>
+          <w:b w:val="0"/>
+          <w:i/>
+          <w:color w:val="6B7280"/>
+          <w:sz w:val="18"/>
+        </w:rPr>
+        <w:t>Figure 1. Supplied end-to-end architecture diagram: ingestion, metadata, orchestration, validation, API, and dashboard flow.</w:t>
+      </w:r>
     </w:p>
     <w:tbl>
       <w:tblPr>
@@ -2330,6 +2382,58 @@
       </w:pPr>
     </w:p>
     <w:p>
+      <w:r>
+        <w:drawing>
+          <wp:inline xmlns:a="http://schemas.openxmlformats.org/drawingml/2006/main" xmlns:pic="http://schemas.openxmlformats.org/drawingml/2006/picture">
+            <wp:extent cx="5989320" cy="3893058"/>
+            <wp:docPr id="2" name="Picture 2"/>
+            <wp:cNvGraphicFramePr>
+              <a:graphicFrameLocks noChangeAspect="1"/>
+            </wp:cNvGraphicFramePr>
+            <a:graphic>
+              <a:graphicData uri="http://schemas.openxmlformats.org/drawingml/2006/picture">
+                <pic:pic>
+                  <pic:nvPicPr>
+                    <pic:cNvPr id="0" name="warehouse_lineage.png"/>
+                    <pic:cNvPicPr/>
+                  </pic:nvPicPr>
+                  <pic:blipFill>
+                    <a:blip r:embed="rId11"/>
+                    <a:stretch>
+                      <a:fillRect/>
+                    </a:stretch>
+                  </pic:blipFill>
+                  <pic:spPr>
+                    <a:xfrm>
+                      <a:off x="0" y="0"/>
+                      <a:ext cx="5989320" cy="3893058"/>
+                    </a:xfrm>
+                    <a:prstGeom prst="rect"/>
+                  </pic:spPr>
+                </pic:pic>
+              </a:graphicData>
+            </a:graphic>
+          </wp:inline>
+        </w:drawing>
+      </w:r>
+    </w:p>
+    <w:p>
+      <w:pPr>
+        <w:spacing w:before="0" w:after="160" w:line="264" w:lineRule="auto"/>
+        <w:jc w:val="center"/>
+      </w:pPr>
+      <w:r>
+        <w:rPr>
+          <w:rFonts w:ascii="Calibri" w:hAnsi="Calibri"/>
+          <w:b w:val="0"/>
+          <w:i/>
+          <w:color w:val="6B7280"/>
+          <w:sz w:val="18"/>
+        </w:rPr>
+        <w:t>Figure 2. Supplied warehouse lineage diagram: Olist source files through Bronze, Silver, Gold, FastAPI, and the React dashboard.</w:t>
+      </w:r>
+    </w:p>
+    <w:p>
       <w:pPr>
         <w:pStyle w:val="Heading1"/>
         <w:keepNext/>
@@ -3562,6 +3666,58 @@
       <w:pPr>
         <w:spacing w:after="40"/>
       </w:pPr>
+    </w:p>
+    <w:p>
+      <w:r>
+        <w:drawing>
+          <wp:inline xmlns:a="http://schemas.openxmlformats.org/drawingml/2006/main" xmlns:pic="http://schemas.openxmlformats.org/drawingml/2006/picture">
+            <wp:extent cx="5989320" cy="2320862"/>
+            <wp:docPr id="3" name="Picture 3"/>
+            <wp:cNvGraphicFramePr>
+              <a:graphicFrameLocks noChangeAspect="1"/>
+            </wp:cNvGraphicFramePr>
+            <a:graphic>
+              <a:graphicData uri="http://schemas.openxmlformats.org/drawingml/2006/picture">
+                <pic:pic>
+                  <pic:nvPicPr>
+                    <pic:cNvPr id="0" name="scd_type_2_flow.png"/>
+                    <pic:cNvPicPr/>
+                  </pic:nvPicPr>
+                  <pic:blipFill>
+                    <a:blip r:embed="rId12"/>
+                    <a:stretch>
+                      <a:fillRect/>
+                    </a:stretch>
+                  </pic:blipFill>
+                  <pic:spPr>
+                    <a:xfrm>
+                      <a:off x="0" y="0"/>
+                      <a:ext cx="5989320" cy="2320862"/>
+                    </a:xfrm>
+                    <a:prstGeom prst="rect"/>
+                  </pic:spPr>
+                </pic:pic>
+              </a:graphicData>
+            </a:graphic>
+          </wp:inline>
+        </w:drawing>
+      </w:r>
+    </w:p>
+    <w:p>
+      <w:pPr>
+        <w:spacing w:before="0" w:after="160" w:line="264" w:lineRule="auto"/>
+        <w:jc w:val="center"/>
+      </w:pPr>
+      <w:r>
+        <w:rPr>
+          <w:rFonts w:ascii="Calibri" w:hAnsi="Calibri"/>
+          <w:b w:val="0"/>
+          <w:i/>
+          <w:color w:val="6B7280"/>
+          <w:sz w:val="18"/>
+        </w:rPr>
+        <w:t>Figure 3. Supplied SCD Type 2 diagram showing the OSASCO to DEMO_CITY_A customer location change.</w:t>
+      </w:r>
     </w:p>
     <w:p>
       <w:pPr>

</xml_diff>